<commit_message>
auto: 작업 변경 (turn end)
</commit_message>
<xml_diff>
--- a/docs/FerryCast_완도군청_제안서_v2.docx
+++ b/docs/FerryCast_완도군청_제안서_v2.docx
@@ -2522,17 +2522,12 @@
           <w:sz w:val="26"/>
           <w:szCs w:val="26"/>
         </w:rPr>
-        <w:t xml:space="preserve">6. 안정적인 운영</w:t>
-      </w:r>
-    </w:p>
-    <w:p>
-      <w:pPr>
-        <w:pStyle w:val="ListParagraph"/>
-        <w:numPr>
-          <w:ilvl w:val="0"/>
-          <w:numId w:val="1"/>
-        </w:numPr>
-        <w:spacing w:after="60" w:line="276"/>
+        <w:t xml:space="preserve">6. 실제 사례 — 해무가 낀 날, 무엇이 벌어지나</w:t>
+      </w:r>
+    </w:p>
+    <w:p>
+      <w:pPr>
+        <w:spacing w:after="100" w:before="0" w:line="276"/>
       </w:pPr>
       <w:r>
         <w:rPr>
@@ -2541,17 +2536,12 @@
           <w:sz w:val="20"/>
           <w:szCs w:val="20"/>
         </w:rPr>
-        <w:t xml:space="preserve">공식 공공 데이터 : 해양교통안전공단·기상청·국립해양조사원의 공식 API를 사용합니다.</w:t>
-      </w:r>
-    </w:p>
-    <w:p>
-      <w:pPr>
-        <w:pStyle w:val="ListParagraph"/>
-        <w:numPr>
-          <w:ilvl w:val="0"/>
-          <w:numId w:val="1"/>
-        </w:numPr>
-        <w:spacing w:after="60" w:line="276"/>
+        <w:t xml:space="preserve">이 서비스가 왜 필요한지, 최근 실제로 있었던 하루로 말씀드립니다.</w:t>
+      </w:r>
+    </w:p>
+    <w:p>
+      <w:pPr>
+        <w:spacing w:after="100" w:before="0" w:line="276"/>
       </w:pPr>
       <w:r>
         <w:rPr>
@@ -2560,83 +2550,7 @@
           <w:sz w:val="20"/>
           <w:szCs w:val="20"/>
         </w:rPr>
-        <w:t xml:space="preserve">시간표와 결항을 함께 : 하나의 공식 데이터로 동시에 받아 시간표와 결항이 어긋나지 않습니다. 청산농협 차도선 같은 지역 배편까지 실시간으로 표시됩니다.</w:t>
-      </w:r>
-    </w:p>
-    <w:p>
-      <w:pPr>
-        <w:pStyle w:val="ListParagraph"/>
-        <w:numPr>
-          <w:ilvl w:val="0"/>
-          <w:numId w:val="1"/>
-        </w:numPr>
-        <w:spacing w:after="60" w:line="276"/>
-      </w:pPr>
-      <w:r>
-        <w:rPr>
-          <w:rFonts w:ascii="맑은 고딕" w:cs="맑은 고딕" w:eastAsia="맑은 고딕" w:hAnsi="맑은 고딕"/>
-          <w:color w:val="334155"/>
-          <w:sz w:val="20"/>
-          <w:szCs w:val="20"/>
-        </w:rPr>
-        <w:t xml:space="preserve">이용자가 늘어도 안정적 : 데이터 호출을 최소화하는 캐시 구조라 접속이 몰려도 무리가 가지 않습니다.</w:t>
-      </w:r>
-    </w:p>
-    <w:p>
-      <w:pPr>
-        <w:pStyle w:val="ListParagraph"/>
-        <w:numPr>
-          <w:ilvl w:val="0"/>
-          <w:numId w:val="1"/>
-        </w:numPr>
-        <w:spacing w:after="60" w:line="276"/>
-      </w:pPr>
-      <w:r>
-        <w:rPr>
-          <w:rFonts w:ascii="맑은 고딕" w:cs="맑은 고딕" w:eastAsia="맑은 고딕" w:hAnsi="맑은 고딕"/>
-          <w:color w:val="334155"/>
-          <w:sz w:val="20"/>
-          <w:szCs w:val="20"/>
-        </w:rPr>
-        <w:t xml:space="preserve">빈 화면 없는 안전망 : 일시적 장애에도 흰 화면 대신 참고 시간표를 표시합니다. 언제 열어도 무언가는 반드시 보입니다.</w:t>
-      </w:r>
-    </w:p>
-    <w:p>
-      <w:pPr>
-        <w:pStyle w:val="ListParagraph"/>
-        <w:numPr>
-          <w:ilvl w:val="0"/>
-          <w:numId w:val="1"/>
-        </w:numPr>
-        <w:spacing w:after="60" w:line="276"/>
-      </w:pPr>
-      <w:r>
-        <w:rPr>
-          <w:rFonts w:ascii="맑은 고딕" w:cs="맑은 고딕" w:eastAsia="맑은 고딕" w:hAnsi="맑은 고딕"/>
-          <w:color w:val="334155"/>
-          <w:sz w:val="20"/>
-          <w:szCs w:val="20"/>
-        </w:rPr>
-        <w:t xml:space="preserve">완도 밖에서도 검증됐습니다 : 완도에서 다진 이 구조를 포항(울릉도)·목포(제주·홍도·흑산도 등)·인천(백령도·연평도) 항로에도 이미 적용해 함께 운영하고 있습니다. 완도가 이 서비스의 출발점이자, 다른 지역에서도 통한다는 사실을 스스로 증명한 셈입니다.</w:t>
-      </w:r>
-    </w:p>
-    <w:p>
-      <w:pPr>
-        <w:pBdr>
-          <w:bottom w:val="single" w:color="1D4ED8" w:sz="8" w:space="4"/>
-        </w:pBdr>
-        <w:spacing w:after="140" w:before="280"/>
-      </w:pPr>
-      <w:r>
-        <w:rPr>
-          <w:rFonts w:ascii="맑은 고딕" w:cs="맑은 고딕" w:eastAsia="맑은 고딕" w:hAnsi="맑은 고딕"/>
-          <w:b/>
-          <w:bCs/>
-          <w:color w:val="1D4ED8"/>
-          <w:sz w:val="26"/>
-          <w:szCs w:val="26"/>
-        </w:rPr>
-        <w:t xml:space="preserve">7. 추진 방안과 일정</w:t>
+        <w:t xml:space="preserve">2026년 7월 19일, 완도 앞바다에 해무(바다 안개)가 꼈습니다. 바람도 파도도 잔잔했지만 시야가 막혀(운항 데이터상 ‘시계제한’) 배가 뜨지 못했습니다. 해무는 이렇게 날씨가 멀쩡해 보여도 출항을 막는, 완도에서 특히 잦은 결항 원인입니다.</w:t>
       </w:r>
     </w:p>
     <w:p>
@@ -2652,21 +2566,7 @@
           <w:sz w:val="22"/>
           <w:szCs w:val="22"/>
         </w:rPr>
-        <w:t xml:space="preserve">이미 현장에 시범 부착했습니다</w:t>
-      </w:r>
-    </w:p>
-    <w:p>
-      <w:pPr>
-        <w:spacing w:after="100" w:before="0" w:line="276"/>
-      </w:pPr>
-      <w:r>
-        <w:rPr>
-          <w:rFonts w:ascii="맑은 고딕" w:cs="맑은 고딕" w:eastAsia="맑은 고딕" w:hAnsi="맑은 고딕"/>
-          <w:color w:val="334155"/>
-          <w:sz w:val="20"/>
-          <w:szCs w:val="20"/>
-        </w:rPr>
-        <w:t xml:space="preserve">서비스의 효용을 직접 확인하고자, 자비로 안내물을 제작해 완도여객선터미널과 완도 진입 경로의 거점인 해남종합버스터미널에 시범 부착해 보았습니다. 실제로 공식 운항시간표 바로 옆에서 이용자들이 휴대폰으로 스캔해 배 시각과 결항을 확인합니다.</w:t>
+        <w:t xml:space="preserve">같은 날, 노선마다 · 배마다 상태가 갈렸습니다</w:t>
       </w:r>
     </w:p>
     <w:tbl>
@@ -2698,19 +2598,21 @@
             </w:tcBorders>
             <w:tcMar>
               <w:top w:type="dxa" w:w="40"/>
-              <w:left w:type="dxa" w:w="40"/>
+              <w:left w:type="dxa" w:w="30"/>
               <w:bottom w:type="dxa" w:w="40"/>
-              <w:right w:type="dxa" w:w="40"/>
-            </w:tcMar>
-          </w:tcPr>
-          <w:p>
-            <w:pPr>
+              <w:right w:type="dxa" w:w="30"/>
+            </w:tcMar>
+            <w:vAlign w:val="center"/>
+          </w:tcPr>
+          <w:p>
+            <w:pPr>
+              <w:spacing w:after="60"/>
               <w:jc w:val="center"/>
             </w:pPr>
             <w:r>
               <w:drawing>
                 <wp:inline distT="0" distB="0" distL="0" distR="0">
-                  <wp:extent cx="1428750" cy="1905000"/>
+                  <wp:extent cx="1428750" cy="600075"/>
                   <wp:effectExtent t="0" r="0" b="0" l="0"/>
                   <wp:docPr id="1" name="" descr="" title=""/>
                   <wp:cNvGraphicFramePr>
@@ -2735,7 +2637,7 @@
                         <pic:spPr bwMode="auto">
                           <a:xfrm>
                             <a:off x="0" y="0"/>
-                            <a:ext cx="1428750" cy="1905000"/>
+                            <a:ext cx="1428750" cy="600075"/>
                           </a:xfrm>
                           <a:prstGeom prst="rect">
                             <a:avLst/>
@@ -2750,17 +2652,34 @@
           </w:p>
           <w:p>
             <w:pPr>
-              <w:spacing w:after="0" w:before="0" w:line="276"/>
+              <w:spacing w:after="20" w:before="0" w:line="276"/>
               <w:jc w:val="center"/>
             </w:pPr>
             <w:r>
               <w:rPr>
                 <w:rFonts w:ascii="맑은 고딕" w:cs="맑은 고딕" w:eastAsia="맑은 고딕" w:hAnsi="맑은 고딕"/>
-                <w:color w:val="64748B"/>
-                <w:sz w:val="16"/>
-                <w:szCs w:val="16"/>
-              </w:rPr>
-              <w:t xml:space="preserve">완도여객선터미널 — 운항시간표 옆</w:t>
+                <w:b/>
+                <w:bCs/>
+                <w:color w:val="1D4ED8"/>
+                <w:sz w:val="17"/>
+                <w:szCs w:val="17"/>
+              </w:rPr>
+              <w:t xml:space="preserve">① 노선 전체 결항</w:t>
+            </w:r>
+          </w:p>
+          <w:p>
+            <w:pPr>
+              <w:spacing w:after="0" w:before="0" w:line="276"/>
+              <w:jc w:val="center"/>
+            </w:pPr>
+            <w:r>
+              <w:rPr>
+                <w:rFonts w:ascii="맑은 고딕" w:cs="맑은 고딕" w:eastAsia="맑은 고딕" w:hAnsi="맑은 고딕"/>
+                <w:color w:val="475569"/>
+                <w:sz w:val="15"/>
+                <w:szCs w:val="15"/>
+              </w:rPr>
+              <w:t xml:space="preserve">완도–소안·보길·노화는 이날 전편 결항 (사유: 시계제한)</w:t>
             </w:r>
           </w:p>
         </w:tc>
@@ -2775,19 +2694,21 @@
             </w:tcBorders>
             <w:tcMar>
               <w:top w:type="dxa" w:w="40"/>
-              <w:left w:type="dxa" w:w="40"/>
+              <w:left w:type="dxa" w:w="30"/>
               <w:bottom w:type="dxa" w:w="40"/>
-              <w:right w:type="dxa" w:w="40"/>
-            </w:tcMar>
-          </w:tcPr>
-          <w:p>
-            <w:pPr>
+              <w:right w:type="dxa" w:w="30"/>
+            </w:tcMar>
+            <w:vAlign w:val="center"/>
+          </w:tcPr>
+          <w:p>
+            <w:pPr>
+              <w:spacing w:after="60"/>
               <w:jc w:val="center"/>
             </w:pPr>
             <w:r>
               <w:drawing>
                 <wp:inline distT="0" distB="0" distL="0" distR="0">
-                  <wp:extent cx="1428750" cy="1905000"/>
+                  <wp:extent cx="1428750" cy="2171700"/>
                   <wp:effectExtent t="0" r="0" b="0" l="0"/>
                   <wp:docPr id="1" name="" descr="" title=""/>
                   <wp:cNvGraphicFramePr>
@@ -2812,7 +2733,7 @@
                         <pic:spPr bwMode="auto">
                           <a:xfrm>
                             <a:off x="0" y="0"/>
-                            <a:ext cx="1428750" cy="1905000"/>
+                            <a:ext cx="1428750" cy="2171700"/>
                           </a:xfrm>
                           <a:prstGeom prst="rect">
                             <a:avLst/>
@@ -2827,17 +2748,34 @@
           </w:p>
           <w:p>
             <w:pPr>
-              <w:spacing w:after="0" w:before="0" w:line="276"/>
+              <w:spacing w:after="20" w:before="0" w:line="276"/>
               <w:jc w:val="center"/>
             </w:pPr>
             <w:r>
               <w:rPr>
                 <w:rFonts w:ascii="맑은 고딕" w:cs="맑은 고딕" w:eastAsia="맑은 고딕" w:hAnsi="맑은 고딕"/>
-                <w:color w:val="64748B"/>
-                <w:sz w:val="16"/>
-                <w:szCs w:val="16"/>
-              </w:rPr>
-              <w:t xml:space="preserve">완도여객선터미널 — 대합실</w:t>
+                <w:b/>
+                <w:bCs/>
+                <w:color w:val="1D4ED8"/>
+                <w:sz w:val="17"/>
+                <w:szCs w:val="17"/>
+              </w:rPr>
+              <w:t xml:space="preserve">② 한 척만 운항</w:t>
+            </w:r>
+          </w:p>
+          <w:p>
+            <w:pPr>
+              <w:spacing w:after="0" w:before="0" w:line="276"/>
+              <w:jc w:val="center"/>
+            </w:pPr>
+            <w:r>
+              <w:rPr>
+                <w:rFonts w:ascii="맑은 고딕" w:cs="맑은 고딕" w:eastAsia="맑은 고딕" w:hAnsi="맑은 고딕"/>
+                <w:color w:val="475569"/>
+                <w:sz w:val="15"/>
+                <w:szCs w:val="15"/>
+              </w:rPr>
+              <w:t xml:space="preserve">약산↔금일은 한 척만 재개해 몇 편만 뜨고 나머지는 결항</w:t>
             </w:r>
           </w:p>
         </w:tc>
@@ -2852,19 +2790,21 @@
             </w:tcBorders>
             <w:tcMar>
               <w:top w:type="dxa" w:w="40"/>
-              <w:left w:type="dxa" w:w="40"/>
+              <w:left w:type="dxa" w:w="30"/>
               <w:bottom w:type="dxa" w:w="40"/>
-              <w:right w:type="dxa" w:w="40"/>
-            </w:tcMar>
-          </w:tcPr>
-          <w:p>
-            <w:pPr>
+              <w:right w:type="dxa" w:w="30"/>
+            </w:tcMar>
+            <w:vAlign w:val="center"/>
+          </w:tcPr>
+          <w:p>
+            <w:pPr>
+              <w:spacing w:after="60"/>
               <w:jc w:val="center"/>
             </w:pPr>
             <w:r>
               <w:drawing>
                 <wp:inline distT="0" distB="0" distL="0" distR="0">
-                  <wp:extent cx="1428750" cy="1905000"/>
+                  <wp:extent cx="1428750" cy="2638425"/>
                   <wp:effectExtent t="0" r="0" b="0" l="0"/>
                   <wp:docPr id="1" name="" descr="" title=""/>
                   <wp:cNvGraphicFramePr>
@@ -2889,6 +2829,565 @@
                         <pic:spPr bwMode="auto">
                           <a:xfrm>
                             <a:off x="0" y="0"/>
+                            <a:ext cx="1428750" cy="2638425"/>
+                          </a:xfrm>
+                          <a:prstGeom prst="rect">
+                            <a:avLst/>
+                          </a:prstGeom>
+                        </pic:spPr>
+                      </pic:pic>
+                    </a:graphicData>
+                  </a:graphic>
+                </wp:inline>
+              </w:drawing>
+            </w:r>
+          </w:p>
+          <w:p>
+            <w:pPr>
+              <w:spacing w:after="20" w:before="0" w:line="276"/>
+              <w:jc w:val="center"/>
+            </w:pPr>
+            <w:r>
+              <w:rPr>
+                <w:rFonts w:ascii="맑은 고딕" w:cs="맑은 고딕" w:eastAsia="맑은 고딕" w:hAnsi="맑은 고딕"/>
+                <w:b/>
+                <w:bCs/>
+                <w:color w:val="1D4ED8"/>
+                <w:sz w:val="17"/>
+                <w:szCs w:val="17"/>
+              </w:rPr>
+              <w:t xml:space="preserve">③ 왜 이 편만?</w:t>
+            </w:r>
+          </w:p>
+          <w:p>
+            <w:pPr>
+              <w:spacing w:after="0" w:before="0" w:line="276"/>
+              <w:jc w:val="center"/>
+            </w:pPr>
+            <w:r>
+              <w:rPr>
+                <w:rFonts w:ascii="맑은 고딕" w:cs="맑은 고딕" w:eastAsia="맑은 고딕" w:hAnsi="맑은 고딕"/>
+                <w:color w:val="475569"/>
+                <w:sz w:val="15"/>
+                <w:szCs w:val="15"/>
+              </w:rPr>
+              <w:t xml:space="preserve">결항 편마다 선박명·사유(시계제한)까지 표시</w:t>
+            </w:r>
+          </w:p>
+        </w:tc>
+      </w:tr>
+    </w:tbl>
+    <w:p>
+      <w:pPr>
+        <w:spacing w:after="100" w:before="0" w:line="276"/>
+      </w:pPr>
+      <w:r>
+        <w:rPr>
+          <w:rFonts w:ascii="맑은 고딕" w:cs="맑은 고딕" w:eastAsia="맑은 고딕" w:hAnsi="맑은 고딕"/>
+          <w:color w:val="334155"/>
+          <w:sz w:val="20"/>
+          <w:szCs w:val="20"/>
+        </w:rPr>
+        <w:t xml:space="preserve">이날 완도–소안·보길·노화 노선은 전편이 결항했습니다(사진①). 반면 약산↔금일 노선은 여러 척이 30분 간격으로 교대 운항하는데, 해무가 걷히기 시작하자 한 척(평화페리9호)만 먼저 운항을 재개했습니다. 이 배가 왕복하는 90분 간격으로 11:00·12:30·14:00·15:30 몇 편만 뜨고, 나머지 배(완농페리3호·풍진메이슨)가 맡은 편은 그대로 결항이었습니다(사진②).</w:t>
+      </w:r>
+    </w:p>
+    <w:p>
+      <w:pPr>
+        <w:spacing w:after="100" w:before="0" w:line="276"/>
+      </w:pPr>
+      <w:r>
+        <w:rPr>
+          <w:rFonts w:ascii="맑은 고딕" w:cs="맑은 고딕" w:eastAsia="맑은 고딕" w:hAnsi="맑은 고딕"/>
+          <w:color w:val="334155"/>
+          <w:sz w:val="20"/>
+          <w:szCs w:val="20"/>
+        </w:rPr>
+        <w:t xml:space="preserve">그래서 시간표가 “결항–결항–운항–결항–운항”처럼 뒤섞여 보입니다. “11:00은 뜨는데 왜 11:30은 안 뜨지?” — 같은 시간대인데 배가 다르기 때문입니다. 이용자로서는 알 길이 없는 정보라, FerryCast는 결항 편에 어느 배가·왜(시계제한) 묶였는지까지 함께 보여줍니다(사진③).</w:t>
+      </w:r>
+    </w:p>
+    <w:tbl>
+      <w:tblPr>
+        <w:tblW w:type="pct" w:w="100%"/>
+        <w:tblBorders>
+          <w:top w:val="single" w:color="auto" w:sz="4"/>
+          <w:left w:val="single" w:color="auto" w:sz="4"/>
+          <w:bottom w:val="single" w:color="auto" w:sz="4"/>
+          <w:right w:val="single" w:color="auto" w:sz="4"/>
+          <w:insideH w:val="single" w:color="auto" w:sz="4"/>
+          <w:insideV w:val="single" w:color="auto" w:sz="4"/>
+        </w:tblBorders>
+      </w:tblPr>
+      <w:tblGrid>
+        <w:gridCol w:w="100"/>
+      </w:tblGrid>
+      <w:tr>
+        <w:tc>
+          <w:tcPr>
+            <w:tcBorders>
+              <w:top w:val="single" w:color="FED7AA" w:sz="4"/>
+              <w:left w:val="single" w:color="FED7AA" w:sz="4"/>
+              <w:bottom w:val="single" w:color="FED7AA" w:sz="4"/>
+              <w:right w:val="single" w:color="FED7AA" w:sz="4"/>
+            </w:tcBorders>
+            <w:shd w:fill="FFF7ED" w:val="clear"/>
+            <w:tcMar>
+              <w:top w:type="dxa" w:w="120"/>
+              <w:left w:type="dxa" w:w="160"/>
+              <w:bottom w:type="dxa" w:w="120"/>
+              <w:right w:type="dxa" w:w="160"/>
+            </w:tcMar>
+          </w:tcPr>
+          <w:p>
+            <w:pPr>
+              <w:spacing w:after="60" w:before="0" w:line="276"/>
+            </w:pPr>
+            <w:r>
+              <w:rPr>
+                <w:rFonts w:ascii="맑은 고딕" w:cs="맑은 고딕" w:eastAsia="맑은 고딕" w:hAnsi="맑은 고딕"/>
+                <w:b/>
+                <w:bCs/>
+                <w:color w:val="C2410C"/>
+                <w:sz w:val="20"/>
+                <w:szCs w:val="20"/>
+              </w:rPr>
+              <w:t xml:space="preserve">전화로도 확인이 안 되던 순간</w:t>
+            </w:r>
+          </w:p>
+          <w:p>
+            <w:pPr>
+              <w:spacing w:after="0" w:before="0" w:line="276"/>
+            </w:pPr>
+            <w:r>
+              <w:rPr>
+                <w:rFonts w:ascii="맑은 고딕" w:cs="맑은 고딕" w:eastAsia="맑은 고딕" w:hAnsi="맑은 고딕"/>
+                <w:color w:val="7C2D12"/>
+                <w:sz w:val="20"/>
+                <w:szCs w:val="20"/>
+              </w:rPr>
+              <w:t xml:space="preserve">이 데이터가 실제와 맞는지 확인하려고, 그날 저는 여러 곳(선사·터미널)에 직접 전화를 돌렸습니다. 그런데 </w:t>
+            </w:r>
+            <w:r>
+              <w:rPr>
+                <w:rFonts w:ascii="맑은 고딕" w:cs="맑은 고딕" w:eastAsia="맑은 고딕" w:hAnsi="맑은 고딕"/>
+                <w:b/>
+                <w:bCs/>
+                <w:color w:val="7C2D12"/>
+                <w:sz w:val="20"/>
+                <w:szCs w:val="20"/>
+              </w:rPr>
+              <w:t xml:space="preserve">어떤 곳은 통화 중이거나 연결이 되지 않아, 전화로도 결항 여부를 확정하지 못하는 순간</w:t>
+            </w:r>
+            <w:r>
+              <w:rPr>
+                <w:rFonts w:ascii="맑은 고딕" w:cs="맑은 고딕" w:eastAsia="맑은 고딕" w:hAnsi="맑은 고딕"/>
+                <w:color w:val="7C2D12"/>
+                <w:sz w:val="20"/>
+                <w:szCs w:val="20"/>
+              </w:rPr>
+              <w:t xml:space="preserve">이 있었습니다. 해무 낀 날은 문의가 몰려 전화가 더 닿지 않습니다. 바로 그 공백에서, 화면 하나로 편별 운항 상태를 그대로 보여주는 정보가 힘을 발휘합니다.</w:t>
+            </w:r>
+          </w:p>
+        </w:tc>
+      </w:tr>
+    </w:tbl>
+    <w:p>
+      <w:pPr>
+        <w:spacing w:after="100" w:before="0" w:line="276"/>
+      </w:pPr>
+      <w:r>
+        <w:rPr>
+          <w:rFonts w:ascii="맑은 고딕" w:cs="맑은 고딕" w:eastAsia="맑은 고딕" w:hAnsi="맑은 고딕"/>
+          <w:color w:val="334155"/>
+          <w:sz w:val="20"/>
+          <w:szCs w:val="20"/>
+        </w:rPr>
+        <w:t xml:space="preserve">물론 최종 확인은 공식 채널의 몫입니다. 그러나 전화가 닿지 않는 그 시간, 터미널까지 나가기 전에 “오늘 이 배가 뜨는지”를 한 화면에서 가늠할 수 있다는 것 — 그것이 완도처럼 결항이 잦고 항로·선박이 얽힌 곳에서 FerryCast가 갖는 값입니다.</w:t>
+      </w:r>
+    </w:p>
+    <w:p>
+      <w:pPr>
+        <w:pageBreakBefore/>
+        <w:pBdr>
+          <w:bottom w:val="single" w:color="1D4ED8" w:sz="8" w:space="4"/>
+        </w:pBdr>
+        <w:spacing w:after="140" w:before="280"/>
+      </w:pPr>
+      <w:r>
+        <w:rPr>
+          <w:rFonts w:ascii="맑은 고딕" w:cs="맑은 고딕" w:eastAsia="맑은 고딕" w:hAnsi="맑은 고딕"/>
+          <w:b/>
+          <w:bCs/>
+          <w:color w:val="1D4ED8"/>
+          <w:sz w:val="26"/>
+          <w:szCs w:val="26"/>
+        </w:rPr>
+        <w:t xml:space="preserve">7. 안정적인 운영</w:t>
+      </w:r>
+    </w:p>
+    <w:p>
+      <w:pPr>
+        <w:pStyle w:val="ListParagraph"/>
+        <w:numPr>
+          <w:ilvl w:val="0"/>
+          <w:numId w:val="1"/>
+        </w:numPr>
+        <w:spacing w:after="60" w:line="276"/>
+      </w:pPr>
+      <w:r>
+        <w:rPr>
+          <w:rFonts w:ascii="맑은 고딕" w:cs="맑은 고딕" w:eastAsia="맑은 고딕" w:hAnsi="맑은 고딕"/>
+          <w:color w:val="334155"/>
+          <w:sz w:val="20"/>
+          <w:szCs w:val="20"/>
+        </w:rPr>
+        <w:t xml:space="preserve">공식 공공 데이터 : 해양교통안전공단·기상청·국립해양조사원의 공식 API를 사용합니다.</w:t>
+      </w:r>
+    </w:p>
+    <w:p>
+      <w:pPr>
+        <w:pStyle w:val="ListParagraph"/>
+        <w:numPr>
+          <w:ilvl w:val="0"/>
+          <w:numId w:val="1"/>
+        </w:numPr>
+        <w:spacing w:after="60" w:line="276"/>
+      </w:pPr>
+      <w:r>
+        <w:rPr>
+          <w:rFonts w:ascii="맑은 고딕" w:cs="맑은 고딕" w:eastAsia="맑은 고딕" w:hAnsi="맑은 고딕"/>
+          <w:color w:val="334155"/>
+          <w:sz w:val="20"/>
+          <w:szCs w:val="20"/>
+        </w:rPr>
+        <w:t xml:space="preserve">시간표와 결항을 함께 : 하나의 공식 데이터로 동시에 받아 시간표와 결항이 어긋나지 않습니다. 청산농협 차도선 같은 지역 배편까지 실시간으로 표시됩니다.</w:t>
+      </w:r>
+    </w:p>
+    <w:p>
+      <w:pPr>
+        <w:pStyle w:val="ListParagraph"/>
+        <w:numPr>
+          <w:ilvl w:val="0"/>
+          <w:numId w:val="1"/>
+        </w:numPr>
+        <w:spacing w:after="60" w:line="276"/>
+      </w:pPr>
+      <w:r>
+        <w:rPr>
+          <w:rFonts w:ascii="맑은 고딕" w:cs="맑은 고딕" w:eastAsia="맑은 고딕" w:hAnsi="맑은 고딕"/>
+          <w:color w:val="334155"/>
+          <w:sz w:val="20"/>
+          <w:szCs w:val="20"/>
+        </w:rPr>
+        <w:t xml:space="preserve">이용자가 늘어도 안정적 : 데이터 호출을 최소화하는 캐시 구조라 접속이 몰려도 무리가 가지 않습니다.</w:t>
+      </w:r>
+    </w:p>
+    <w:p>
+      <w:pPr>
+        <w:pStyle w:val="ListParagraph"/>
+        <w:numPr>
+          <w:ilvl w:val="0"/>
+          <w:numId w:val="1"/>
+        </w:numPr>
+        <w:spacing w:after="60" w:line="276"/>
+      </w:pPr>
+      <w:r>
+        <w:rPr>
+          <w:rFonts w:ascii="맑은 고딕" w:cs="맑은 고딕" w:eastAsia="맑은 고딕" w:hAnsi="맑은 고딕"/>
+          <w:color w:val="334155"/>
+          <w:sz w:val="20"/>
+          <w:szCs w:val="20"/>
+        </w:rPr>
+        <w:t xml:space="preserve">빈 화면 없는 안전망 : 일시적 장애에도 흰 화면 대신 참고 시간표를 표시합니다. 언제 열어도 무언가는 반드시 보입니다.</w:t>
+      </w:r>
+    </w:p>
+    <w:p>
+      <w:pPr>
+        <w:pStyle w:val="ListParagraph"/>
+        <w:numPr>
+          <w:ilvl w:val="0"/>
+          <w:numId w:val="1"/>
+        </w:numPr>
+        <w:spacing w:after="60" w:line="276"/>
+      </w:pPr>
+      <w:r>
+        <w:rPr>
+          <w:rFonts w:ascii="맑은 고딕" w:cs="맑은 고딕" w:eastAsia="맑은 고딕" w:hAnsi="맑은 고딕"/>
+          <w:color w:val="334155"/>
+          <w:sz w:val="20"/>
+          <w:szCs w:val="20"/>
+        </w:rPr>
+        <w:t xml:space="preserve">완도 밖에서도 검증됐습니다 : 완도에서 다진 이 구조를 포항(울릉도)·목포(제주·홍도·흑산도 등)·인천(백령도·연평도) 항로에도 이미 적용해 함께 운영하고 있습니다. 완도가 이 서비스의 출발점이자, 다른 지역에서도 통한다는 사실을 스스로 증명한 셈입니다.</w:t>
+      </w:r>
+    </w:p>
+    <w:p>
+      <w:pPr>
+        <w:pBdr>
+          <w:bottom w:val="single" w:color="1D4ED8" w:sz="8" w:space="4"/>
+        </w:pBdr>
+        <w:spacing w:after="140" w:before="280"/>
+      </w:pPr>
+      <w:r>
+        <w:rPr>
+          <w:rFonts w:ascii="맑은 고딕" w:cs="맑은 고딕" w:eastAsia="맑은 고딕" w:hAnsi="맑은 고딕"/>
+          <w:b/>
+          <w:bCs/>
+          <w:color w:val="1D4ED8"/>
+          <w:sz w:val="26"/>
+          <w:szCs w:val="26"/>
+        </w:rPr>
+        <w:t xml:space="preserve">8. 추진 방안과 일정</w:t>
+      </w:r>
+    </w:p>
+    <w:p>
+      <w:pPr>
+        <w:spacing w:after="80" w:before="160" w:line="276"/>
+      </w:pPr>
+      <w:r>
+        <w:rPr>
+          <w:rFonts w:ascii="맑은 고딕" w:cs="맑은 고딕" w:eastAsia="맑은 고딕" w:hAnsi="맑은 고딕"/>
+          <w:b/>
+          <w:bCs/>
+          <w:color w:val="1E293B"/>
+          <w:sz w:val="22"/>
+          <w:szCs w:val="22"/>
+        </w:rPr>
+        <w:t xml:space="preserve">이미 현장에 시범 부착했습니다</w:t>
+      </w:r>
+    </w:p>
+    <w:p>
+      <w:pPr>
+        <w:spacing w:after="100" w:before="0" w:line="276"/>
+      </w:pPr>
+      <w:r>
+        <w:rPr>
+          <w:rFonts w:ascii="맑은 고딕" w:cs="맑은 고딕" w:eastAsia="맑은 고딕" w:hAnsi="맑은 고딕"/>
+          <w:color w:val="334155"/>
+          <w:sz w:val="20"/>
+          <w:szCs w:val="20"/>
+        </w:rPr>
+        <w:t xml:space="preserve">서비스의 효용을 직접 확인하고자, 자비로 안내물을 제작해 완도여객선터미널과 완도 진입 경로의 거점인 해남종합버스터미널에 시범 부착해 보았습니다. 실제로 공식 운항시간표 바로 옆에서 이용자들이 휴대폰으로 스캔해 배 시각과 결항을 확인합니다.</w:t>
+      </w:r>
+    </w:p>
+    <w:tbl>
+      <w:tblPr>
+        <w:tblW w:type="pct" w:w="100%"/>
+        <w:tblBorders>
+          <w:top w:val="single" w:color="auto" w:sz="4"/>
+          <w:left w:val="single" w:color="auto" w:sz="4"/>
+          <w:bottom w:val="single" w:color="auto" w:sz="4"/>
+          <w:right w:val="single" w:color="auto" w:sz="4"/>
+          <w:insideH w:val="single" w:color="auto" w:sz="4"/>
+          <w:insideV w:val="single" w:color="auto" w:sz="4"/>
+        </w:tblBorders>
+      </w:tblPr>
+      <w:tblGrid>
+        <w:gridCol w:w="100"/>
+        <w:gridCol w:w="100"/>
+        <w:gridCol w:w="100"/>
+      </w:tblGrid>
+      <w:tr>
+        <w:tc>
+          <w:tcPr>
+            <w:tcW w:type="pct" w:w="33%"/>
+            <w:tcBorders>
+              <w:top w:val="none"/>
+              <w:left w:val="none"/>
+              <w:bottom w:val="none"/>
+              <w:right w:val="none"/>
+            </w:tcBorders>
+            <w:tcMar>
+              <w:top w:type="dxa" w:w="40"/>
+              <w:left w:type="dxa" w:w="40"/>
+              <w:bottom w:type="dxa" w:w="40"/>
+              <w:right w:type="dxa" w:w="40"/>
+            </w:tcMar>
+          </w:tcPr>
+          <w:p>
+            <w:pPr>
+              <w:jc w:val="center"/>
+            </w:pPr>
+            <w:r>
+              <w:drawing>
+                <wp:inline distT="0" distB="0" distL="0" distR="0">
+                  <wp:extent cx="1428750" cy="1905000"/>
+                  <wp:effectExtent t="0" r="0" b="0" l="0"/>
+                  <wp:docPr id="1" name="" descr="" title=""/>
+                  <wp:cNvGraphicFramePr>
+                    <a:graphicFrameLocks xmlns:a="http://schemas.openxmlformats.org/drawingml/2006/main" noChangeAspect="1"/>
+                  </wp:cNvGraphicFramePr>
+                  <a:graphic xmlns:a="http://schemas.openxmlformats.org/drawingml/2006/main">
+                    <a:graphicData uri="http://schemas.openxmlformats.org/drawingml/2006/picture">
+                      <pic:pic xmlns:pic="http://schemas.openxmlformats.org/drawingml/2006/picture">
+                        <pic:nvPicPr>
+                          <pic:cNvPr id="0" name="" descr=""/>
+                          <pic:cNvPicPr>
+                            <a:picLocks noChangeAspect="1" noChangeArrowheads="1"/>
+                          </pic:cNvPicPr>
+                        </pic:nvPicPr>
+                        <pic:blipFill>
+                          <a:blip r:embed="rId18" cstate="none"/>
+                          <a:srcRect/>
+                          <a:stretch>
+                            <a:fillRect/>
+                          </a:stretch>
+                        </pic:blipFill>
+                        <pic:spPr bwMode="auto">
+                          <a:xfrm>
+                            <a:off x="0" y="0"/>
+                            <a:ext cx="1428750" cy="1905000"/>
+                          </a:xfrm>
+                          <a:prstGeom prst="rect">
+                            <a:avLst/>
+                          </a:prstGeom>
+                        </pic:spPr>
+                      </pic:pic>
+                    </a:graphicData>
+                  </a:graphic>
+                </wp:inline>
+              </w:drawing>
+            </w:r>
+          </w:p>
+          <w:p>
+            <w:pPr>
+              <w:spacing w:after="0" w:before="0" w:line="276"/>
+              <w:jc w:val="center"/>
+            </w:pPr>
+            <w:r>
+              <w:rPr>
+                <w:rFonts w:ascii="맑은 고딕" w:cs="맑은 고딕" w:eastAsia="맑은 고딕" w:hAnsi="맑은 고딕"/>
+                <w:color w:val="64748B"/>
+                <w:sz w:val="16"/>
+                <w:szCs w:val="16"/>
+              </w:rPr>
+              <w:t xml:space="preserve">완도여객선터미널 — 운항시간표 옆</w:t>
+            </w:r>
+          </w:p>
+        </w:tc>
+        <w:tc>
+          <w:tcPr>
+            <w:tcW w:type="pct" w:w="33%"/>
+            <w:tcBorders>
+              <w:top w:val="none"/>
+              <w:left w:val="none"/>
+              <w:bottom w:val="none"/>
+              <w:right w:val="none"/>
+            </w:tcBorders>
+            <w:tcMar>
+              <w:top w:type="dxa" w:w="40"/>
+              <w:left w:type="dxa" w:w="40"/>
+              <w:bottom w:type="dxa" w:w="40"/>
+              <w:right w:type="dxa" w:w="40"/>
+            </w:tcMar>
+          </w:tcPr>
+          <w:p>
+            <w:pPr>
+              <w:jc w:val="center"/>
+            </w:pPr>
+            <w:r>
+              <w:drawing>
+                <wp:inline distT="0" distB="0" distL="0" distR="0">
+                  <wp:extent cx="1428750" cy="1905000"/>
+                  <wp:effectExtent t="0" r="0" b="0" l="0"/>
+                  <wp:docPr id="1" name="" descr="" title=""/>
+                  <wp:cNvGraphicFramePr>
+                    <a:graphicFrameLocks xmlns:a="http://schemas.openxmlformats.org/drawingml/2006/main" noChangeAspect="1"/>
+                  </wp:cNvGraphicFramePr>
+                  <a:graphic xmlns:a="http://schemas.openxmlformats.org/drawingml/2006/main">
+                    <a:graphicData uri="http://schemas.openxmlformats.org/drawingml/2006/picture">
+                      <pic:pic xmlns:pic="http://schemas.openxmlformats.org/drawingml/2006/picture">
+                        <pic:nvPicPr>
+                          <pic:cNvPr id="0" name="" descr=""/>
+                          <pic:cNvPicPr>
+                            <a:picLocks noChangeAspect="1" noChangeArrowheads="1"/>
+                          </pic:cNvPicPr>
+                        </pic:nvPicPr>
+                        <pic:blipFill>
+                          <a:blip r:embed="rId19" cstate="none"/>
+                          <a:srcRect/>
+                          <a:stretch>
+                            <a:fillRect/>
+                          </a:stretch>
+                        </pic:blipFill>
+                        <pic:spPr bwMode="auto">
+                          <a:xfrm>
+                            <a:off x="0" y="0"/>
+                            <a:ext cx="1428750" cy="1905000"/>
+                          </a:xfrm>
+                          <a:prstGeom prst="rect">
+                            <a:avLst/>
+                          </a:prstGeom>
+                        </pic:spPr>
+                      </pic:pic>
+                    </a:graphicData>
+                  </a:graphic>
+                </wp:inline>
+              </w:drawing>
+            </w:r>
+          </w:p>
+          <w:p>
+            <w:pPr>
+              <w:spacing w:after="0" w:before="0" w:line="276"/>
+              <w:jc w:val="center"/>
+            </w:pPr>
+            <w:r>
+              <w:rPr>
+                <w:rFonts w:ascii="맑은 고딕" w:cs="맑은 고딕" w:eastAsia="맑은 고딕" w:hAnsi="맑은 고딕"/>
+                <w:color w:val="64748B"/>
+                <w:sz w:val="16"/>
+                <w:szCs w:val="16"/>
+              </w:rPr>
+              <w:t xml:space="preserve">완도여객선터미널 — 대합실</w:t>
+            </w:r>
+          </w:p>
+        </w:tc>
+        <w:tc>
+          <w:tcPr>
+            <w:tcW w:type="pct" w:w="33%"/>
+            <w:tcBorders>
+              <w:top w:val="none"/>
+              <w:left w:val="none"/>
+              <w:bottom w:val="none"/>
+              <w:right w:val="none"/>
+            </w:tcBorders>
+            <w:tcMar>
+              <w:top w:type="dxa" w:w="40"/>
+              <w:left w:type="dxa" w:w="40"/>
+              <w:bottom w:type="dxa" w:w="40"/>
+              <w:right w:type="dxa" w:w="40"/>
+            </w:tcMar>
+          </w:tcPr>
+          <w:p>
+            <w:pPr>
+              <w:jc w:val="center"/>
+            </w:pPr>
+            <w:r>
+              <w:drawing>
+                <wp:inline distT="0" distB="0" distL="0" distR="0">
+                  <wp:extent cx="1428750" cy="1905000"/>
+                  <wp:effectExtent t="0" r="0" b="0" l="0"/>
+                  <wp:docPr id="1" name="" descr="" title=""/>
+                  <wp:cNvGraphicFramePr>
+                    <a:graphicFrameLocks xmlns:a="http://schemas.openxmlformats.org/drawingml/2006/main" noChangeAspect="1"/>
+                  </wp:cNvGraphicFramePr>
+                  <a:graphic xmlns:a="http://schemas.openxmlformats.org/drawingml/2006/main">
+                    <a:graphicData uri="http://schemas.openxmlformats.org/drawingml/2006/picture">
+                      <pic:pic xmlns:pic="http://schemas.openxmlformats.org/drawingml/2006/picture">
+                        <pic:nvPicPr>
+                          <pic:cNvPr id="0" name="" descr=""/>
+                          <pic:cNvPicPr>
+                            <a:picLocks noChangeAspect="1" noChangeArrowheads="1"/>
+                          </pic:cNvPicPr>
+                        </pic:nvPicPr>
+                        <pic:blipFill>
+                          <a:blip r:embed="rId20" cstate="none"/>
+                          <a:srcRect/>
+                          <a:stretch>
+                            <a:fillRect/>
+                          </a:stretch>
+                        </pic:blipFill>
+                        <pic:spPr bwMode="auto">
+                          <a:xfrm>
+                            <a:off x="0" y="0"/>
                             <a:ext cx="1428750" cy="1905000"/>
                           </a:xfrm>
                           <a:prstGeom prst="rect">
@@ -3394,7 +3893,7 @@
           <w:sz w:val="26"/>
           <w:szCs w:val="26"/>
         </w:rPr>
-        <w:t xml:space="preserve">8. 완도군의 기대 효과</w:t>
+        <w:t xml:space="preserve">9. 완도군의 기대 효과</w:t>
       </w:r>
     </w:p>
     <w:p>
@@ -3503,7 +4002,7 @@
           <w:sz w:val="26"/>
           <w:szCs w:val="26"/>
         </w:rPr>
-        <w:t xml:space="preserve">9. 운영 방식과 지속가능성</w:t>
+        <w:t xml:space="preserve">10. 운영 방식과 지속가능성</w:t>
       </w:r>
     </w:p>
     <w:p>
@@ -3856,7 +4355,7 @@
                     </pic:cNvPicPr>
                   </pic:nvPicPr>
                   <pic:blipFill>
-                    <a:blip r:embed="rId18" cstate="none"/>
+                    <a:blip r:embed="rId21" cstate="none"/>
                     <a:srcRect/>
                     <a:stretch>
                       <a:fillRect/>
@@ -3909,7 +4408,7 @@
           <w:sz w:val="26"/>
           <w:szCs w:val="26"/>
         </w:rPr>
-        <w:t xml:space="preserve">10. 예상 우려와 대응</w:t>
+        <w:t xml:space="preserve">11. 예상 우려와 대응</w:t>
       </w:r>
     </w:p>
     <w:tbl>
@@ -4342,7 +4841,7 @@
           <w:sz w:val="26"/>
           <w:szCs w:val="26"/>
         </w:rPr>
-        <w:t xml:space="preserve">11. 완도군청에 드리는 요청</w:t>
+        <w:t xml:space="preserve">12. 완도군청에 드리는 요청</w:t>
       </w:r>
     </w:p>
     <w:tbl>
@@ -4872,7 +5371,7 @@
           <w:sz w:val="26"/>
           <w:szCs w:val="26"/>
         </w:rPr>
-        <w:t xml:space="preserve">12. 제안자 의견</w:t>
+        <w:t xml:space="preserve">13. 제안자 의견</w:t>
       </w:r>
     </w:p>
     <w:p>

</xml_diff>